<commit_message>
test(docx): stabilize report layout and platform visual coverage
</commit_message>
<xml_diff>
--- a/test/fixtures/docx-report.docx
+++ b/test/fixtures/docx-report.docx
@@ -47,9 +47,9 @@
         <w:tblLook w:firstRow="1" w:lastRow="0" w:firstColumn="0" w:lastColumn="0" w:noHBand="0" w:noVBand="0" w:val="0020"/>
       </w:tblPr>
       <w:tblGrid>
-        <w:gridCol w:w="838"/>
-        <w:gridCol w:w="5963"/>
-        <w:gridCol w:w="1118"/>
+        <w:gridCol w:w="1584"/>
+        <w:gridCol w:w="4752"/>
+        <w:gridCol w:w="1584"/>
       </w:tblGrid>
       <w:tr>
         <w:trPr>
@@ -190,7 +190,7 @@
               <w:rPr>
                 <w:rFonts w:hint="eastAsia"/>
               </w:rPr>
-              <w:t xml:space="preserve">NADPH，长文本应在单元格内自然换行。</w:t>
+              <w:t xml:space="preserve">NADPH，长文本应在单元格内自然换行。这里补充反应步骤与能量来源的说明，用于观察中文和英文缩写混排时的行高、表格列宽与段落间距，正文应保持常规字重。</w:t>
             </w:r>
           </w:p>
         </w:tc>

</xml_diff>